<commit_message>
remove assurence premium, and add reserve in pv
</commit_message>
<xml_diff>
--- a/document_templates/PVs/PV-validated-md.docx
+++ b/document_templates/PVs/PV-validated-md.docx
@@ -564,20 +564,50 @@
           <w:ilvl w:val="0"/>
           <w:numId w:val="0"/>
         </w:numPr>
-        <w:ind w:leftChars="0" w:firstLine="708" w:firstLineChars="0"/>
-        <w:rPr>
-          <w:rFonts w:hint="default" w:ascii="Times New Roman" w:hAnsi="Times New Roman" w:cs="Times New Roman"/>
-          <w:sz w:val="24"/>
-          <w:szCs w:val="24"/>
-        </w:rPr>
-      </w:pPr>
-      <w:r>
-        <w:rPr>
-          <w:rFonts w:hint="default" w:ascii="Times New Roman" w:hAnsi="Times New Roman" w:cs="Times New Roman"/>
-          <w:sz w:val="24"/>
-          <w:szCs w:val="24"/>
-        </w:rPr>
-        <w:t>Montant                                                         </w:t>
+        <w:rPr>
+          <w:rFonts w:hint="default" w:ascii="Times New Roman" w:hAnsi="Times New Roman" w:cs="Times New Roman"/>
+          <w:sz w:val="24"/>
+          <w:szCs w:val="24"/>
+        </w:rPr>
+      </w:pPr>
+      <w:bookmarkStart w:id="3" w:name="_GoBack"/>
+      <w:r>
+        <w:rPr>
+          <w:rFonts w:hint="default" w:ascii="Times New Roman" w:hAnsi="Times New Roman" w:cs="Times New Roman"/>
+          <w:sz w:val="24"/>
+          <w:szCs w:val="24"/>
+        </w:rPr>
+        <w:t>Montant</w:t>
+      </w:r>
+      <w:r>
+        <w:rPr>
+          <w:rFonts w:hint="default" w:ascii="Times New Roman" w:hAnsi="Times New Roman" w:cs="Times New Roman"/>
+          <w:sz w:val="24"/>
+          <w:szCs w:val="24"/>
+          <w:lang w:val="en-US"/>
+        </w:rPr>
+        <w:tab/>
+        <w:t/>
+      </w:r>
+      <w:r>
+        <w:rPr>
+          <w:rFonts w:hint="default" w:ascii="Times New Roman" w:hAnsi="Times New Roman" w:cs="Times New Roman"/>
+          <w:sz w:val="24"/>
+          <w:szCs w:val="24"/>
+          <w:lang w:val="en-US"/>
+        </w:rPr>
+        <w:tab/>
+        <w:t/>
+      </w:r>
+      <w:r>
+        <w:rPr>
+          <w:rFonts w:hint="default" w:ascii="Times New Roman" w:hAnsi="Times New Roman" w:cs="Times New Roman"/>
+          <w:sz w:val="24"/>
+          <w:szCs w:val="24"/>
+          <w:lang w:val="en-US"/>
+        </w:rPr>
+        <w:tab/>
+        <w:t/>
       </w:r>
       <w:r>
         <w:rPr>
@@ -630,20 +660,64 @@
           <w:ilvl w:val="0"/>
           <w:numId w:val="0"/>
         </w:numPr>
-        <w:ind w:leftChars="0" w:firstLine="708" w:firstLineChars="0"/>
-        <w:rPr>
-          <w:rFonts w:hint="default" w:ascii="Times New Roman" w:hAnsi="Times New Roman" w:cs="Times New Roman"/>
-          <w:sz w:val="24"/>
-          <w:szCs w:val="24"/>
-        </w:rPr>
-      </w:pPr>
-      <w:r>
-        <w:rPr>
-          <w:rFonts w:hint="default" w:ascii="Times New Roman" w:hAnsi="Times New Roman" w:cs="Times New Roman"/>
-          <w:sz w:val="24"/>
-          <w:szCs w:val="24"/>
-        </w:rPr>
-        <w:t>Durée                                                                 </w:t>
+        <w:rPr>
+          <w:rFonts w:hint="default" w:ascii="Times New Roman" w:hAnsi="Times New Roman" w:cs="Times New Roman"/>
+          <w:sz w:val="24"/>
+          <w:szCs w:val="24"/>
+        </w:rPr>
+      </w:pPr>
+      <w:r>
+        <w:rPr>
+          <w:rFonts w:hint="default" w:ascii="Times New Roman" w:hAnsi="Times New Roman" w:cs="Times New Roman"/>
+          <w:sz w:val="24"/>
+          <w:szCs w:val="24"/>
+        </w:rPr>
+        <w:t>Durée</w:t>
+      </w:r>
+      <w:r>
+        <w:rPr>
+          <w:rFonts w:hint="default" w:ascii="Times New Roman" w:hAnsi="Times New Roman" w:cs="Times New Roman"/>
+          <w:sz w:val="24"/>
+          <w:szCs w:val="24"/>
+          <w:lang w:val="en-US"/>
+        </w:rPr>
+        <w:tab/>
+      </w:r>
+      <w:r>
+        <w:rPr>
+          <w:rFonts w:hint="default" w:ascii="Times New Roman" w:hAnsi="Times New Roman" w:cs="Times New Roman"/>
+          <w:sz w:val="24"/>
+          <w:szCs w:val="24"/>
+          <w:lang w:val="en-US"/>
+        </w:rPr>
+        <w:tab/>
+      </w:r>
+      <w:r>
+        <w:rPr>
+          <w:rFonts w:hint="default" w:ascii="Times New Roman" w:hAnsi="Times New Roman" w:cs="Times New Roman"/>
+          <w:sz w:val="24"/>
+          <w:szCs w:val="24"/>
+          <w:lang w:val="en-US"/>
+        </w:rPr>
+        <w:tab/>
+      </w:r>
+      <w:r>
+        <w:rPr>
+          <w:rFonts w:hint="default" w:ascii="Times New Roman" w:hAnsi="Times New Roman" w:cs="Times New Roman"/>
+          <w:sz w:val="24"/>
+          <w:szCs w:val="24"/>
+          <w:lang w:val="en-US"/>
+        </w:rPr>
+        <w:tab/>
+      </w:r>
+      <w:r>
+        <w:rPr>
+          <w:rFonts w:hint="default" w:ascii="Times New Roman" w:hAnsi="Times New Roman" w:cs="Times New Roman"/>
+          <w:sz w:val="24"/>
+          <w:szCs w:val="24"/>
+          <w:lang w:val="en-US"/>
+        </w:rPr>
+        <w:tab/>
       </w:r>
       <w:r>
         <w:rPr>
@@ -687,20 +761,55 @@
           <w:ilvl w:val="0"/>
           <w:numId w:val="0"/>
         </w:numPr>
-        <w:ind w:leftChars="0" w:firstLine="708" w:firstLineChars="0"/>
-        <w:rPr>
-          <w:rFonts w:hint="default" w:ascii="Times New Roman" w:hAnsi="Times New Roman" w:cs="Times New Roman"/>
-          <w:sz w:val="24"/>
-          <w:szCs w:val="24"/>
-        </w:rPr>
-      </w:pPr>
-      <w:r>
-        <w:rPr>
-          <w:rFonts w:hint="default" w:ascii="Times New Roman" w:hAnsi="Times New Roman" w:cs="Times New Roman"/>
-          <w:sz w:val="24"/>
-          <w:szCs w:val="24"/>
-        </w:rPr>
-        <w:t>Périodicité                                                          </w:t>
+        <w:rPr>
+          <w:rFonts w:hint="default" w:ascii="Times New Roman" w:hAnsi="Times New Roman" w:cs="Times New Roman"/>
+          <w:sz w:val="24"/>
+          <w:szCs w:val="24"/>
+        </w:rPr>
+      </w:pPr>
+      <w:r>
+        <w:rPr>
+          <w:rFonts w:hint="default" w:ascii="Times New Roman" w:hAnsi="Times New Roman" w:cs="Times New Roman"/>
+          <w:sz w:val="24"/>
+          <w:szCs w:val="24"/>
+        </w:rPr>
+        <w:t>Périodicité</w:t>
+      </w:r>
+      <w:r>
+        <w:rPr>
+          <w:rFonts w:hint="default" w:ascii="Times New Roman" w:hAnsi="Times New Roman" w:cs="Times New Roman"/>
+          <w:sz w:val="24"/>
+          <w:szCs w:val="24"/>
+          <w:lang w:val="en-US"/>
+        </w:rPr>
+        <w:tab/>
+      </w:r>
+      <w:r>
+        <w:rPr>
+          <w:rFonts w:hint="default" w:ascii="Times New Roman" w:hAnsi="Times New Roman" w:cs="Times New Roman"/>
+          <w:sz w:val="24"/>
+          <w:szCs w:val="24"/>
+          <w:lang w:val="en-US"/>
+        </w:rPr>
+        <w:tab/>
+      </w:r>
+      <w:r>
+        <w:rPr>
+          <w:rFonts w:hint="default" w:ascii="Times New Roman" w:hAnsi="Times New Roman" w:cs="Times New Roman"/>
+          <w:sz w:val="24"/>
+          <w:szCs w:val="24"/>
+          <w:lang w:val="en-US"/>
+        </w:rPr>
+        <w:tab/>
+      </w:r>
+      <w:r>
+        <w:rPr>
+          <w:rFonts w:hint="default" w:ascii="Times New Roman" w:hAnsi="Times New Roman" w:cs="Times New Roman"/>
+          <w:sz w:val="24"/>
+          <w:szCs w:val="24"/>
+          <w:lang w:val="en-US"/>
+        </w:rPr>
+        <w:tab/>
       </w:r>
       <w:r>
         <w:rPr>
@@ -736,20 +845,46 @@
           <w:ilvl w:val="0"/>
           <w:numId w:val="0"/>
         </w:numPr>
-        <w:ind w:leftChars="0" w:firstLine="708" w:firstLineChars="0"/>
-        <w:rPr>
-          <w:rFonts w:hint="default" w:ascii="Times New Roman" w:hAnsi="Times New Roman" w:cs="Times New Roman"/>
-          <w:sz w:val="24"/>
-          <w:szCs w:val="24"/>
-        </w:rPr>
-      </w:pPr>
-      <w:r>
-        <w:rPr>
-          <w:rFonts w:hint="default" w:ascii="Times New Roman" w:hAnsi="Times New Roman" w:cs="Times New Roman"/>
-          <w:sz w:val="24"/>
-          <w:szCs w:val="24"/>
-        </w:rPr>
-        <w:t>Taux d’Intérêt HT                                             </w:t>
+        <w:rPr>
+          <w:rFonts w:hint="default" w:ascii="Times New Roman" w:hAnsi="Times New Roman" w:cs="Times New Roman"/>
+          <w:sz w:val="24"/>
+          <w:szCs w:val="24"/>
+        </w:rPr>
+      </w:pPr>
+      <w:r>
+        <w:rPr>
+          <w:rFonts w:hint="default" w:ascii="Times New Roman" w:hAnsi="Times New Roman" w:cs="Times New Roman"/>
+          <w:sz w:val="24"/>
+          <w:szCs w:val="24"/>
+        </w:rPr>
+        <w:t>Taux d’Intérêt HT</w:t>
+      </w:r>
+      <w:r>
+        <w:rPr>
+          <w:rFonts w:hint="default" w:ascii="Times New Roman" w:hAnsi="Times New Roman" w:cs="Times New Roman"/>
+          <w:sz w:val="24"/>
+          <w:szCs w:val="24"/>
+          <w:lang w:val="en-US"/>
+        </w:rPr>
+        <w:tab/>
+      </w:r>
+      <w:r>
+        <w:rPr>
+          <w:rFonts w:hint="default" w:ascii="Times New Roman" w:hAnsi="Times New Roman" w:cs="Times New Roman"/>
+          <w:sz w:val="24"/>
+          <w:szCs w:val="24"/>
+          <w:lang w:val="en-US"/>
+        </w:rPr>
+        <w:tab/>
+      </w:r>
+      <w:r>
+        <w:rPr>
+          <w:rFonts w:hint="default" w:ascii="Times New Roman" w:hAnsi="Times New Roman" w:cs="Times New Roman"/>
+          <w:sz w:val="24"/>
+          <w:szCs w:val="24"/>
+          <w:lang w:val="en-US"/>
+        </w:rPr>
+        <w:tab/>
       </w:r>
       <w:r>
         <w:rPr>
@@ -793,20 +928,64 @@
           <w:ilvl w:val="0"/>
           <w:numId w:val="0"/>
         </w:numPr>
-        <w:ind w:leftChars="0" w:firstLine="708" w:firstLineChars="0"/>
-        <w:rPr>
-          <w:rFonts w:hint="default" w:ascii="Times New Roman" w:hAnsi="Times New Roman" w:cs="Times New Roman"/>
-          <w:sz w:val="24"/>
-          <w:szCs w:val="24"/>
-        </w:rPr>
-      </w:pPr>
-      <w:r>
-        <w:rPr>
-          <w:rFonts w:hint="default" w:ascii="Times New Roman" w:hAnsi="Times New Roman" w:cs="Times New Roman"/>
-          <w:sz w:val="24"/>
-          <w:szCs w:val="24"/>
-        </w:rPr>
-        <w:t>TAF                                                                   </w:t>
+        <w:rPr>
+          <w:rFonts w:hint="default" w:ascii="Times New Roman" w:hAnsi="Times New Roman" w:cs="Times New Roman"/>
+          <w:sz w:val="24"/>
+          <w:szCs w:val="24"/>
+        </w:rPr>
+      </w:pPr>
+      <w:r>
+        <w:rPr>
+          <w:rFonts w:hint="default" w:ascii="Times New Roman" w:hAnsi="Times New Roman" w:cs="Times New Roman"/>
+          <w:sz w:val="24"/>
+          <w:szCs w:val="24"/>
+        </w:rPr>
+        <w:t>TAF</w:t>
+      </w:r>
+      <w:r>
+        <w:rPr>
+          <w:rFonts w:hint="default" w:ascii="Times New Roman" w:hAnsi="Times New Roman" w:cs="Times New Roman"/>
+          <w:sz w:val="24"/>
+          <w:szCs w:val="24"/>
+          <w:lang w:val="en-US"/>
+        </w:rPr>
+        <w:tab/>
+      </w:r>
+      <w:r>
+        <w:rPr>
+          <w:rFonts w:hint="default" w:ascii="Times New Roman" w:hAnsi="Times New Roman" w:cs="Times New Roman"/>
+          <w:sz w:val="24"/>
+          <w:szCs w:val="24"/>
+          <w:lang w:val="en-US"/>
+        </w:rPr>
+        <w:tab/>
+      </w:r>
+      <w:r>
+        <w:rPr>
+          <w:rFonts w:hint="default" w:ascii="Times New Roman" w:hAnsi="Times New Roman" w:cs="Times New Roman"/>
+          <w:sz w:val="24"/>
+          <w:szCs w:val="24"/>
+          <w:lang w:val="en-US"/>
+        </w:rPr>
+        <w:tab/>
+      </w:r>
+      <w:r>
+        <w:rPr>
+          <w:rFonts w:hint="default" w:ascii="Times New Roman" w:hAnsi="Times New Roman" w:cs="Times New Roman"/>
+          <w:sz w:val="24"/>
+          <w:szCs w:val="24"/>
+          <w:lang w:val="en-US"/>
+        </w:rPr>
+        <w:tab/>
+      </w:r>
+      <w:r>
+        <w:rPr>
+          <w:rFonts w:hint="default" w:ascii="Times New Roman" w:hAnsi="Times New Roman" w:cs="Times New Roman"/>
+          <w:sz w:val="24"/>
+          <w:szCs w:val="24"/>
+          <w:lang w:val="en-US"/>
+        </w:rPr>
+        <w:tab/>
       </w:r>
       <w:r>
         <w:rPr>
@@ -850,20 +1029,49 @@
           <w:ilvl w:val="0"/>
           <w:numId w:val="0"/>
         </w:numPr>
-        <w:ind w:leftChars="0" w:firstLine="708" w:firstLineChars="0"/>
-        <w:rPr>
-          <w:rFonts w:hint="default" w:ascii="Times New Roman" w:hAnsi="Times New Roman" w:cs="Times New Roman"/>
-          <w:sz w:val="24"/>
-          <w:szCs w:val="24"/>
-        </w:rPr>
-      </w:pPr>
-      <w:r>
-        <w:rPr>
-          <w:rFonts w:hint="default" w:ascii="Times New Roman" w:hAnsi="Times New Roman" w:cs="Times New Roman"/>
-          <w:sz w:val="24"/>
-          <w:szCs w:val="24"/>
-        </w:rPr>
-        <w:t>Echéance TTC                                                   </w:t>
+        <w:rPr>
+          <w:rFonts w:hint="default" w:ascii="Times New Roman" w:hAnsi="Times New Roman" w:cs="Times New Roman"/>
+          <w:sz w:val="24"/>
+          <w:szCs w:val="24"/>
+        </w:rPr>
+      </w:pPr>
+      <w:r>
+        <w:rPr>
+          <w:rFonts w:hint="default" w:ascii="Times New Roman" w:hAnsi="Times New Roman" w:cs="Times New Roman"/>
+          <w:sz w:val="24"/>
+          <w:szCs w:val="24"/>
+        </w:rPr>
+        <w:t>Echéance TTC</w:t>
+      </w:r>
+      <w:r>
+        <w:rPr>
+          <w:rFonts w:hint="default" w:ascii="Times New Roman" w:hAnsi="Times New Roman" w:cs="Times New Roman"/>
+          <w:sz w:val="24"/>
+          <w:szCs w:val="24"/>
+          <w:lang w:val="en-US"/>
+        </w:rPr>
+        <w:tab/>
+        <w:t/>
+      </w:r>
+      <w:r>
+        <w:rPr>
+          <w:rFonts w:hint="default" w:ascii="Times New Roman" w:hAnsi="Times New Roman" w:cs="Times New Roman"/>
+          <w:sz w:val="24"/>
+          <w:szCs w:val="24"/>
+          <w:lang w:val="en-US"/>
+        </w:rPr>
+        <w:tab/>
+        <w:t/>
+      </w:r>
+      <w:r>
+        <w:rPr>
+          <w:rFonts w:hint="default" w:ascii="Times New Roman" w:hAnsi="Times New Roman" w:cs="Times New Roman"/>
+          <w:sz w:val="24"/>
+          <w:szCs w:val="24"/>
+          <w:lang w:val="en-US"/>
+        </w:rPr>
+        <w:tab/>
+        <w:t/>
       </w:r>
       <w:r>
         <w:rPr>
@@ -907,7 +1115,6 @@
           <w:ilvl w:val="0"/>
           <w:numId w:val="0"/>
         </w:numPr>
-        <w:ind w:leftChars="0" w:firstLine="708" w:firstLineChars="0"/>
         <w:rPr>
           <w:rFonts w:hint="default" w:ascii="Times New Roman" w:hAnsi="Times New Roman" w:cs="Times New Roman"/>
           <w:sz w:val="24"/>
@@ -964,33 +1171,17 @@
           <w:lang w:val="en-US"/>
         </w:rPr>
         <w:tab/>
-      </w:r>
-      <w:r>
-        <w:rPr>
-          <w:rFonts w:hint="default" w:ascii="Times New Roman" w:hAnsi="Times New Roman" w:cs="Times New Roman"/>
-          <w:sz w:val="24"/>
-          <w:szCs w:val="24"/>
-          <w:lang w:val="en-US"/>
-        </w:rPr>
-        <w:tab/>
-      </w:r>
-      <w:r>
-        <w:rPr>
-          <w:rFonts w:hint="default" w:ascii="Times New Roman" w:hAnsi="Times New Roman" w:cs="Times New Roman"/>
-          <w:sz w:val="24"/>
-          <w:szCs w:val="24"/>
-          <w:lang w:val="en-US"/>
-        </w:rPr>
-        <w:tab/>
-      </w:r>
-      <w:r>
-        <w:rPr>
-          <w:rFonts w:hint="default" w:ascii="Times New Roman" w:hAnsi="Times New Roman" w:cs="Times New Roman"/>
-          <w:sz w:val="24"/>
-          <w:szCs w:val="24"/>
-          <w:lang w:val="en-US"/>
-        </w:rPr>
-        <w:t>: ${administrative_fees_percentage.value}</w:t>
+        <w:t/>
+      </w:r>
+      <w:r>
+        <w:rPr>
+          <w:rFonts w:hint="default" w:ascii="Times New Roman" w:hAnsi="Times New Roman" w:cs="Times New Roman"/>
+          <w:sz w:val="24"/>
+          <w:szCs w:val="24"/>
+          <w:lang w:val="en-US"/>
+        </w:rPr>
+        <w:tab/>
+        <w:t>:${administrative_fees_percentage.value}</w:t>
       </w:r>
       <w:r>
         <w:rPr>
@@ -1008,20 +1199,46 @@
           <w:ilvl w:val="0"/>
           <w:numId w:val="0"/>
         </w:numPr>
-        <w:ind w:leftChars="0" w:firstLine="708" w:firstLineChars="0"/>
-        <w:rPr>
-          <w:rFonts w:hint="default" w:ascii="Times New Roman" w:hAnsi="Times New Roman" w:cs="Times New Roman"/>
-          <w:sz w:val="24"/>
-          <w:szCs w:val="24"/>
-        </w:rPr>
-      </w:pPr>
-      <w:r>
-        <w:rPr>
-          <w:rFonts w:hint="default" w:ascii="Times New Roman" w:hAnsi="Times New Roman" w:cs="Times New Roman"/>
-          <w:sz w:val="24"/>
-          <w:szCs w:val="24"/>
-        </w:rPr>
-        <w:t xml:space="preserve">Prime d’assurance                                             </w:t>
+        <w:rPr>
+          <w:rFonts w:hint="default" w:ascii="Times New Roman" w:hAnsi="Times New Roman" w:cs="Times New Roman"/>
+          <w:sz w:val="24"/>
+          <w:szCs w:val="24"/>
+        </w:rPr>
+      </w:pPr>
+      <w:r>
+        <w:rPr>
+          <w:rFonts w:hint="default" w:ascii="Times New Roman" w:hAnsi="Times New Roman" w:cs="Times New Roman"/>
+          <w:sz w:val="24"/>
+          <w:szCs w:val="24"/>
+        </w:rPr>
+        <w:t>Prime d’assurance</w:t>
+      </w:r>
+      <w:r>
+        <w:rPr>
+          <w:rFonts w:hint="default" w:ascii="Times New Roman" w:hAnsi="Times New Roman" w:cs="Times New Roman"/>
+          <w:sz w:val="24"/>
+          <w:szCs w:val="24"/>
+          <w:lang w:val="en-US"/>
+        </w:rPr>
+        <w:tab/>
+      </w:r>
+      <w:r>
+        <w:rPr>
+          <w:rFonts w:hint="default" w:ascii="Times New Roman" w:hAnsi="Times New Roman" w:cs="Times New Roman"/>
+          <w:sz w:val="24"/>
+          <w:szCs w:val="24"/>
+          <w:lang w:val="en-US"/>
+        </w:rPr>
+        <w:tab/>
+      </w:r>
+      <w:r>
+        <w:rPr>
+          <w:rFonts w:hint="default" w:ascii="Times New Roman" w:hAnsi="Times New Roman" w:cs="Times New Roman"/>
+          <w:sz w:val="24"/>
+          <w:szCs w:val="24"/>
+          <w:lang w:val="en-US"/>
+        </w:rPr>
+        <w:tab/>
       </w:r>
       <w:r>
         <w:rPr>
@@ -1047,7 +1264,7 @@
           <w:szCs w:val="24"/>
           <w:lang w:val="en-US"/>
         </w:rPr>
-        <w:t>${insurance_premium} F CFA</w:t>
+        <w:t>« selon la grille de l’assureur »</w:t>
       </w:r>
     </w:p>
     <w:p>
@@ -1057,7 +1274,6 @@
           <w:ilvl w:val="0"/>
           <w:numId w:val="0"/>
         </w:numPr>
-        <w:ind w:leftChars="0" w:firstLine="708" w:firstLineChars="0"/>
         <w:rPr>
           <w:rFonts w:hint="default" w:ascii="Times New Roman" w:hAnsi="Times New Roman" w:cs="Times New Roman"/>
           <w:sz w:val="24"/>
@@ -1074,14 +1290,7 @@
         </w:rPr>
         <w:t>${line_review_bonus}</w:t>
       </w:r>
-      <w:r>
-        <w:rPr>
-          <w:rFonts w:hint="default" w:ascii="Times New Roman" w:hAnsi="Times New Roman" w:cs="Times New Roman"/>
-          <w:sz w:val="24"/>
-          <w:szCs w:val="24"/>
-        </w:rPr>
-        <w:t xml:space="preserve"> </w:t>
-      </w:r>
+      <w:bookmarkEnd w:id="3"/>
     </w:p>
     <w:p>
       <w:pPr>
@@ -1172,16 +1381,16 @@
           <w:sz w:val="24"/>
           <w:szCs w:val="24"/>
         </w:rPr>
-        <w:t>${type_of_guarantee.name} de ${value}</w:t>
-      </w:r>
-      <w:r>
-        <w:rPr>
-          <w:rFonts w:hint="default" w:ascii="Times New Roman" w:hAnsi="Times New Roman" w:cs="Times New Roman"/>
-          <w:sz w:val="24"/>
-          <w:szCs w:val="24"/>
-          <w:lang w:val="en-US"/>
-        </w:rPr>
-        <w:t xml:space="preserve"> FCFA: </w:t>
+        <w:t xml:space="preserve">${type_of_guarantee.name} </w:t>
+      </w:r>
+      <w:r>
+        <w:rPr>
+          <w:rFonts w:hint="default" w:ascii="Times New Roman" w:hAnsi="Times New Roman" w:cs="Times New Roman"/>
+          <w:sz w:val="24"/>
+          <w:szCs w:val="24"/>
+          <w:lang w:val="en-US"/>
+        </w:rPr>
+        <w:t xml:space="preserve">: </w:t>
       </w:r>
       <w:r>
         <w:rPr>
@@ -1444,7 +1653,6 @@
                 <w:szCs w:val="24"/>
               </w:rPr>
             </w:pPr>
-            <w:bookmarkStart w:id="3" w:name="_GoBack"/>
             <w:r>
               <w:rPr>
                 <w:rFonts w:hint="default" w:ascii="Times New Roman" w:hAnsi="Times New Roman" w:cs="Times New Roman"/>
@@ -1497,7 +1705,6 @@
           </w:p>
         </w:tc>
       </w:tr>
-      <w:bookmarkEnd w:id="3"/>
     </w:tbl>
     <w:p>
       <w:pPr>

</xml_diff>

<commit_message>
add entity_name for contrat generation
</commit_message>
<xml_diff>
--- a/document_templates/PVs/PV-validated-md.docx
+++ b/document_templates/PVs/PV-validated-md.docx
@@ -124,6 +124,67 @@
     <w:p>
       <w:pPr>
         <w:rPr>
+          <w:rFonts w:hint="default" w:ascii="Times New Roman" w:hAnsi="Times New Roman" w:eastAsia="Times New Roman" w:cs="Times New Roman"/>
+          <w:bCs/>
+          <w:sz w:val="24"/>
+          <w:szCs w:val="24"/>
+          <w:lang w:val="en-US" w:eastAsia="fr-FR"/>
+        </w:rPr>
+      </w:pPr>
+      <w:r>
+        <w:rPr>
+          <w:rFonts w:hint="default" w:ascii="Times New Roman" w:hAnsi="Times New Roman" w:eastAsia="Times New Roman" w:cs="Times New Roman"/>
+          <w:bCs/>
+          <w:sz w:val="24"/>
+          <w:szCs w:val="24"/>
+          <w:lang w:val="en-US" w:eastAsia="fr-FR"/>
+        </w:rPr>
+        <w:t>Analyste</w:t>
+      </w:r>
+      <w:r>
+        <w:rPr>
+          <w:rFonts w:hint="default" w:ascii="Times New Roman" w:hAnsi="Times New Roman" w:eastAsia="Times New Roman" w:cs="Times New Roman"/>
+          <w:bCs/>
+          <w:sz w:val="24"/>
+          <w:szCs w:val="24"/>
+          <w:lang w:val="it-IT" w:eastAsia="fr-FR"/>
+        </w:rPr>
+        <w:t xml:space="preserve">                                                        </w:t>
+      </w:r>
+      <w:r>
+        <w:rPr>
+          <w:rFonts w:hint="default" w:ascii="Times New Roman" w:hAnsi="Times New Roman" w:eastAsia="Times New Roman" w:cs="Times New Roman"/>
+          <w:bCs/>
+          <w:sz w:val="24"/>
+          <w:szCs w:val="24"/>
+          <w:lang w:val="en-US" w:eastAsia="fr-FR"/>
+        </w:rPr>
+        <w:tab/>
+      </w:r>
+      <w:r>
+        <w:rPr>
+          <w:rFonts w:hint="default" w:ascii="Times New Roman" w:hAnsi="Times New Roman" w:eastAsia="Times New Roman" w:cs="Times New Roman"/>
+          <w:bCs/>
+          <w:sz w:val="24"/>
+          <w:szCs w:val="24"/>
+          <w:lang w:val="it-IT" w:eastAsia="fr-FR"/>
+        </w:rPr>
+        <w:t xml:space="preserve">: </w:t>
+      </w:r>
+      <w:r>
+        <w:rPr>
+          <w:rFonts w:hint="default" w:ascii="Times New Roman" w:hAnsi="Times New Roman" w:eastAsia="Times New Roman" w:cs="Times New Roman"/>
+          <w:bCs/>
+          <w:sz w:val="24"/>
+          <w:szCs w:val="24"/>
+          <w:lang w:val="en-US" w:eastAsia="fr-FR"/>
+        </w:rPr>
+        <w:t>${credit_analyst.full_name}</w:t>
+      </w:r>
+    </w:p>
+    <w:p>
+      <w:pPr>
+        <w:rPr>
           <w:rFonts w:hint="default" w:ascii="Times New Roman" w:hAnsi="Times New Roman" w:cs="Times New Roman"/>
           <w:b/>
           <w:bCs/>
@@ -161,6 +222,7 @@
         </w:rPr>
         <w:t xml:space="preserve">: </w:t>
       </w:r>
+      <w:bookmarkStart w:id="3" w:name="_GoBack"/>
       <w:r>
         <w:rPr>
           <w:rFonts w:hint="default" w:ascii="Times New Roman" w:hAnsi="Times New Roman" w:cs="Times New Roman"/>
@@ -169,27 +231,9 @@
           <w:shd w:val="clear" w:color="auto" w:fill="FFFFFF"/>
           <w:lang w:val="en-US"/>
         </w:rPr>
-        <w:t>${</w:t>
-      </w:r>
-      <w:r>
-        <w:rPr>
-          <w:rFonts w:hint="default" w:ascii="Times New Roman" w:hAnsi="Times New Roman" w:cs="Times New Roman"/>
-          <w:b w:val="0"/>
-          <w:bCs w:val="0"/>
-          <w:shd w:val="clear" w:color="auto" w:fill="FFFFFF"/>
-        </w:rPr>
-        <w:t>applicant_full_name</w:t>
-      </w:r>
-      <w:r>
-        <w:rPr>
-          <w:rFonts w:hint="default" w:ascii="Times New Roman" w:hAnsi="Times New Roman" w:cs="Times New Roman"/>
-          <w:b w:val="0"/>
-          <w:bCs w:val="0"/>
-          <w:shd w:val="clear" w:color="auto" w:fill="FFFFFF"/>
-          <w:lang w:val="en-US"/>
-        </w:rPr>
-        <w:t>}</w:t>
-      </w:r>
+        <w:t>${entity_name}</w:t>
+      </w:r>
+      <w:bookmarkEnd w:id="3"/>
     </w:p>
     <w:p>
       <w:pPr>
@@ -570,7 +614,6 @@
           <w:szCs w:val="24"/>
         </w:rPr>
       </w:pPr>
-      <w:bookmarkStart w:id="3" w:name="_GoBack"/>
       <w:r>
         <w:rPr>
           <w:rFonts w:hint="default" w:ascii="Times New Roman" w:hAnsi="Times New Roman" w:cs="Times New Roman"/>
@@ -587,27 +630,24 @@
           <w:lang w:val="en-US"/>
         </w:rPr>
         <w:tab/>
-        <w:t/>
-      </w:r>
-      <w:r>
-        <w:rPr>
-          <w:rFonts w:hint="default" w:ascii="Times New Roman" w:hAnsi="Times New Roman" w:cs="Times New Roman"/>
-          <w:sz w:val="24"/>
-          <w:szCs w:val="24"/>
-          <w:lang w:val="en-US"/>
-        </w:rPr>
-        <w:tab/>
-        <w:t/>
-      </w:r>
-      <w:r>
-        <w:rPr>
-          <w:rFonts w:hint="default" w:ascii="Times New Roman" w:hAnsi="Times New Roman" w:cs="Times New Roman"/>
-          <w:sz w:val="24"/>
-          <w:szCs w:val="24"/>
-          <w:lang w:val="en-US"/>
-        </w:rPr>
-        <w:tab/>
-        <w:t/>
+      </w:r>
+      <w:r>
+        <w:rPr>
+          <w:rFonts w:hint="default" w:ascii="Times New Roman" w:hAnsi="Times New Roman" w:cs="Times New Roman"/>
+          <w:sz w:val="24"/>
+          <w:szCs w:val="24"/>
+          <w:lang w:val="en-US"/>
+        </w:rPr>
+        <w:tab/>
+      </w:r>
+      <w:r>
+        <w:rPr>
+          <w:rFonts w:hint="default" w:ascii="Times New Roman" w:hAnsi="Times New Roman" w:cs="Times New Roman"/>
+          <w:sz w:val="24"/>
+          <w:szCs w:val="24"/>
+          <w:lang w:val="en-US"/>
+        </w:rPr>
+        <w:tab/>
       </w:r>
       <w:r>
         <w:rPr>
@@ -1051,27 +1091,24 @@
           <w:lang w:val="en-US"/>
         </w:rPr>
         <w:tab/>
-        <w:t/>
-      </w:r>
-      <w:r>
-        <w:rPr>
-          <w:rFonts w:hint="default" w:ascii="Times New Roman" w:hAnsi="Times New Roman" w:cs="Times New Roman"/>
-          <w:sz w:val="24"/>
-          <w:szCs w:val="24"/>
-          <w:lang w:val="en-US"/>
-        </w:rPr>
-        <w:tab/>
-        <w:t/>
-      </w:r>
-      <w:r>
-        <w:rPr>
-          <w:rFonts w:hint="default" w:ascii="Times New Roman" w:hAnsi="Times New Roman" w:cs="Times New Roman"/>
-          <w:sz w:val="24"/>
-          <w:szCs w:val="24"/>
-          <w:lang w:val="en-US"/>
-        </w:rPr>
-        <w:tab/>
-        <w:t/>
+      </w:r>
+      <w:r>
+        <w:rPr>
+          <w:rFonts w:hint="default" w:ascii="Times New Roman" w:hAnsi="Times New Roman" w:cs="Times New Roman"/>
+          <w:sz w:val="24"/>
+          <w:szCs w:val="24"/>
+          <w:lang w:val="en-US"/>
+        </w:rPr>
+        <w:tab/>
+      </w:r>
+      <w:r>
+        <w:rPr>
+          <w:rFonts w:hint="default" w:ascii="Times New Roman" w:hAnsi="Times New Roman" w:cs="Times New Roman"/>
+          <w:sz w:val="24"/>
+          <w:szCs w:val="24"/>
+          <w:lang w:val="en-US"/>
+        </w:rPr>
+        <w:tab/>
       </w:r>
       <w:r>
         <w:rPr>
@@ -1171,16 +1208,23 @@
           <w:lang w:val="en-US"/>
         </w:rPr>
         <w:tab/>
-        <w:t/>
-      </w:r>
-      <w:r>
-        <w:rPr>
-          <w:rFonts w:hint="default" w:ascii="Times New Roman" w:hAnsi="Times New Roman" w:cs="Times New Roman"/>
-          <w:sz w:val="24"/>
-          <w:szCs w:val="24"/>
-          <w:lang w:val="en-US"/>
-        </w:rPr>
-        <w:tab/>
+      </w:r>
+      <w:r>
+        <w:rPr>
+          <w:rFonts w:hint="default" w:ascii="Times New Roman" w:hAnsi="Times New Roman" w:cs="Times New Roman"/>
+          <w:sz w:val="24"/>
+          <w:szCs w:val="24"/>
+          <w:lang w:val="en-US"/>
+        </w:rPr>
+        <w:tab/>
+      </w:r>
+      <w:r>
+        <w:rPr>
+          <w:rFonts w:hint="default" w:ascii="Times New Roman" w:hAnsi="Times New Roman" w:cs="Times New Roman"/>
+          <w:sz w:val="24"/>
+          <w:szCs w:val="24"/>
+          <w:lang w:val="en-US"/>
+        </w:rPr>
         <w:t>:${administrative_fees_percentage.value}</w:t>
       </w:r>
       <w:r>
@@ -1290,7 +1334,6 @@
         </w:rPr>
         <w:t>${line_review_bonus}</w:t>
       </w:r>
-      <w:bookmarkEnd w:id="3"/>
     </w:p>
     <w:p>
       <w:pPr>

</xml_diff>